<commit_message>
Résolution des incohérences de l'enquête via le baromètre Doctoome source
- Tableau 3 : « Aucune utilisation » (5-6 %) vs 197/1 850 expliqué — parts
  de citations (question 7 à choix multiples) vs parts d'individus ; note
  méthodologique ajoutée aux § 3.6.2-3.6.3
- Figure 12 (Bénéfices perçus) : graphique du baromètre inséré, numéro
  attribué (suite de la Figure 11 ; l'ancien « Figure 8 » était un doublon
  du ch. 2)
- Échantillon précisé « plus de 1 850 répondants » (préambule du baromètre)
- Tous les chiffres des Tableaux 1 à 7 vérifiés conformes aux diapositives

Co-Authored-By: Claude Fable 5 <noreply@anthropic.com>
Claude-Session: https://claude.ai/code/session_013yAqgJXfz5Fkiyo6JLEfwJ
</commit_message>
<xml_diff>
--- a/partie3-revue-pubmed/Partie3_VERSION_FINALE.docx
+++ b/partie3-revue-pubmed/Partie3_VERSION_FINALE.docx
@@ -472,7 +472,7 @@
         <w:jc w:val="both"/>
       </w:pPr>
       <w:r>
-        <w:t>L’échantillon réunit 1 850 répondants, couvrant l’ensemble des tranches d’âge de 18 à plus de 65 ans et toutes les régions. Le numérique en santé apparaît très largement diffusé au sein de cette population : seuls 197 répondants déclarent n’utiliser aucun outil numérique en santé, soit environ une personne sur dix. Ce constat liminaire situe l’enquête auprès d’une population majoritairement utilisatrice, ce qui doit être gardé à l’esprit pour l’interprétation (voir limites, chapitre 4).</w:t>
+        <w:t>L’échantillon réunit plus de 1 850 répondants, couvrant l’ensemble des tranches d’âge de 18 à plus de 65 ans et toutes les régions. Le numérique en santé apparaît très largement diffusé au sein de cette population : seuls 197 répondants déclarent n’utiliser aucun outil numérique en santé, soit environ une personne sur dix. Ce constat liminaire situe l’enquête auprès d’une population majoritairement utilisatrice, ce qui doit être gardé à l’esprit pour l’interprétation (voir limites, chapitre 4).</w:t>
       </w:r>
     </w:p>
     <w:p>
@@ -1153,6 +1153,14 @@
     </w:tbl>
     <w:p>
       <w:pPr>
+        <w:jc w:val="both"/>
+      </w:pPr>
+      <w:r>
+        <w:t>Les pourcentages des Tableaux 2 et 3 correspondent à la répartition des outils cités en réponse à une question à choix multiples (question 7 du questionnaire, reproduite en annexe) : ils décrivent la structure des usages déclarés, et non la proportion d’utilisateurs de chaque outil au sein de l’échantillon.</w:t>
+      </w:r>
+    </w:p>
+    <w:p>
+      <w:pPr>
         <w:pStyle w:val="Heading3"/>
       </w:pPr>
       <w:r>
@@ -1523,12 +1531,11 @@
       </w:tr>
     </w:tbl>
     <w:p>
+      <w:pPr>
+        <w:jc w:val="both"/>
+      </w:pPr>
       <w:r>
-        <w:rPr>
-          <w:b/>
-          <w:color w:val="C00000"/>
-        </w:rPr>
-        <w:t>[à compléter : harmoniser la ligne « Aucune utilisation » (5-6 %) avec les 197/1 850 non-utilisateurs (10,6 %) du § 3.6.1 — préciser la base de calcul des deux indicateurs dans le baromètre]</w:t>
+        <w:t>La ligne « Aucune utilisation » du Tableau 3 (5 à 6 % des outils cités dans chaque sous-groupe) ne peut donc pas être rapprochée directement de la part des personnes n’utilisant aucun outil numérique en santé (197 répondants, soit environ une personne sur dix, cf. § 3.6.1 et Tableau 1) : la première rapporte une part de citations, la seconde une part d’individus. Ces deux indicateurs, calculés sur des bases différentes, sont complémentaires et non contradictoires.</w:t>
       </w:r>
     </w:p>
     <w:p>
@@ -2173,35 +2180,50 @@
         <w:jc w:val="center"/>
       </w:pPr>
       <w:r>
-        <w:rPr>
-          <w:b/>
-          <w:sz w:val="20"/>
-        </w:rPr>
-        <w:t xml:space="preserve">Figure </w:t>
+        <w:drawing>
+          <wp:inline xmlns:a="http://schemas.openxmlformats.org/drawingml/2006/main" xmlns:pic="http://schemas.openxmlformats.org/drawingml/2006/picture">
+            <wp:extent cx="5760000" cy="1385567"/>
+            <wp:docPr id="1" name="Picture 1"/>
+            <wp:cNvGraphicFramePr>
+              <a:graphicFrameLocks noChangeAspect="1"/>
+            </wp:cNvGraphicFramePr>
+            <a:graphic>
+              <a:graphicData uri="http://schemas.openxmlformats.org/drawingml/2006/picture">
+                <pic:pic>
+                  <pic:nvPicPr>
+                    <pic:cNvPr id="0" name="figure12_benefices_percus.png"/>
+                    <pic:cNvPicPr/>
+                  </pic:nvPicPr>
+                  <pic:blipFill>
+                    <a:blip r:embed="rId9"/>
+                    <a:stretch>
+                      <a:fillRect/>
+                    </a:stretch>
+                  </pic:blipFill>
+                  <pic:spPr>
+                    <a:xfrm>
+                      <a:off x="0" y="0"/>
+                      <a:ext cx="5760000" cy="1385567"/>
+                    </a:xfrm>
+                    <a:prstGeom prst="rect"/>
+                  </pic:spPr>
+                </pic:pic>
+              </a:graphicData>
+            </a:graphic>
+          </wp:inline>
+        </w:drawing>
       </w:r>
-      <w:r>
-        <w:rPr>
-          <w:b/>
-          <w:color w:val="C00000"/>
-          <w:sz w:val="20"/>
-        </w:rPr>
-        <w:t>[n° à attribuer]</w:t>
-      </w:r>
+    </w:p>
+    <w:p>
+      <w:pPr>
+        <w:jc w:val="center"/>
+      </w:pPr>
       <w:r>
         <w:rPr>
           <w:b/>
           <w:sz w:val="20"/>
         </w:rPr>
-        <w:t xml:space="preserve"> — Bénéfices perçus du numérique en santé selon l’âge (source : Baromètre Doctoome #eSANTÉ26, 2026)</w:t>
-      </w:r>
-    </w:p>
-    <w:p>
-      <w:r>
-        <w:rPr>
-          <w:b/>
-          <w:color w:val="C00000"/>
-        </w:rPr>
-        <w:t>[à compléter : insérer ici le graphique correspondant du baromètre #eSANTÉ26]</w:t>
+        <w:t>Figure 12 — Bénéfices perçus du numérique en santé selon l’âge (source : Baromètre Doctoome #eSANTÉ26, 2026)</w:t>
       </w:r>
     </w:p>
     <w:p>

</xml_diff>